<commit_message>
docs(paper): add model selection resource allocation section
</commit_message>
<xml_diff>
--- a/workbench_paper.edited.docx
+++ b/workbench_paper.edited.docx
@@ -7077,6 +7077,32 @@
     <w:p>
       <w:r>
         <w:t>The Leader-Worker separation addresses a fundamental challenge: different tasks require different capabilities. Architectural reasoning benefits from high-reasoning models; code implementation benefits from specialized coding agents; routine organization benefits from lightweight models. The Leader routes tasks to the most appropriate Worker without requiring a single agent to handle all responsibilities.</w:t>
+      </w:r>
+    </w:p>
+    <w:p>
+      <w:pPr>
+        <w:pStyle w:val="4"/>
+      </w:pPr>
+      <w:r>
+        <w:t>4.4.1 Model Selection and Resource Allocation</w:t>
+      </w:r>
+    </w:p>
+    <w:p>
+      <w:pPr/>
+      <w:r>
+        <w:t>Long-term project efficiency is shaped not only by context length but also by the fit between model capability and task complexity. Routing a simple task to a high-reasoning model can impose unnecessary computation cost, while routing a complex or high-risk task to an under-capable model can produce errors, rework, and additional context consumption.</w:t>
+      </w:r>
+    </w:p>
+    <w:p>
+      <w:pPr/>
+      <w:r>
+        <w:t>Accordingly, the Leader is responsible not only for task decomposition and state coordination but also for selecting an appropriate execution path. After interpreting a user goal, the Leader converts it into a bounded Assignment, estimates its complexity and risk, and selects an Agent, model, or reasoning level. Routine tasks may use lower-cost Workers, while architectural or high-risk design tasks may require stronger models and closer review.</w:t>
+      </w:r>
+    </w:p>
+    <w:p>
+      <w:pPr/>
+      <w:r>
+        <w:t>This mechanism does not create a new Agent runtime. It allows existing Agents to be dispatched within the continuity and governance constraints of the Project World. Model capability is a replaceable resource, not the source of project continuity; the Leader coordinates resources, while the Project World preserves long-term state. Together with the compression layers described in Chapter 5, this addresses two distinct sources of waste: repeated information and mismatched computation.</w:t>
       </w:r>
     </w:p>
     <w:p>

</xml_diff>